<commit_message>
Deployed 1f3acabd with MkDocs version: 1.6.1
</commit_message>
<xml_diff>
--- a/download/controllable_unit.docx
+++ b/download/controllable_unit.docx
@@ -853,7 +853,7 @@
               <w:pStyle w:val="Compact"/>
             </w:pPr>
             <w:r>
-              <w:t xml:space="preserve">Maximum continuous active power that the controllable unit can produce or consume, i.e. deliver for balancing and congestion services, in kilowatts.</w:t>
+              <w:t xml:space="preserve">Maximum continuous active power (flexible power) that the controllable unit can produce or consume, i.e. deliver for balancing and congestion services, in kilowatts.</w:t>
             </w:r>
           </w:p>
         </w:tc>
@@ -3965,7 +3965,7 @@
     <w:bookmarkEnd w:id="47"/>
     <w:bookmarkEnd w:id="48"/>
     <w:sectPr>
-      <w:headerReference r:id="rId11" w:type="default"/>
+      <w:headerReference r:id="rId9" w:type="default"/>
       <w:pgSz w:h="11906" w:orient="landscape" w:w="16838"/>
       <w:pgMar w:bottom="1417" w:footer="708" w:gutter="0" w:header="708" w:left="1417" w:right="1417" w:top="1417"/>
       <w:cols w:space="708"/>

</xml_diff>